<commit_message>
docs: align build manuals and BD wiring with SoundSight
</commit_message>
<xml_diff>
--- a/document/manuals/SoundSight_100MHz_工程架构模块接口与接合手册.docx
+++ b/document/manuals/SoundSight_100MHz_工程架构模块接口与接合手册.docx
@@ -25,7 +25,7 @@
     </w:p>
     <w:p>
       <w:r>
-        <w:t>现在已经有两套可阅读、可复现定向测试的源码候选：主方案是 PL + STM32 + PS/PYNQ；另有无 STM32、由 PS 接替解算和控制的独立实验版。旧纯 FPGA 工程保留。新的源码还没有经过本候选的综合、实现和实板验证，因此不能称为完整上板通过。</w:t>
+        <w:t>本手册以独立SoundSight项目为准：主方案是PL＋STM32；另有无STM32、由PS接替解算和控制的独立目标。两版共用project/rtl和software/common，旧工程不再是依赖。本候选综合、实现和实板验证仍未完成。所有相对路径从SoundSight根目录起算。</w:t>
       </w:r>
     </w:p>
     <w:tbl>
@@ -347,17 +347,13 @@
     </w:p>
     <w:p>
       <w:r>
-        <w:t>这份材料供阅读与后续修改，不要求现在运行Vivado，也没有自动构建、下载或动作步骤。</w:t>
-      </w:r>
-    </w:p>
-    <w:p>
-      <w:r>
-        <w:br w:type="page"/>
+        <w:t>本手册用于在新项目中理解模块、手动建立BD及核对连线。真实DDR/MIO/PYNQ由A配置；综合和实现由A点击，本手册没有自动下载或执行器操作。</w:t>
       </w:r>
     </w:p>
     <w:p>
       <w:pPr>
         <w:pStyle w:val="Heading1"/>
+        <w:pageBreakBefore/>
       </w:pPr>
       <w:r>
         <w:t>一 现在的架构和算法</w:t>
@@ -445,7 +441,7 @@
         <w:br/>
         <w:t>阶段0待处理、1成功、2拒绝、3数值错、4协议错、5取消、6跳过。六对都终结才发布；终结不等于成功。无效数值清零但保留原因。</w:t>
         <w:br/>
-        <w:t>完整位域与寄存器表直接见contract/stm32/FROZEN_SSOT_ABI.md及共享头，文档不另造一套偏移。</w:t>
+        <w:t>完整位域与寄存器表直接见software/common/FROZEN_SSOT_ABI.md及共享头，文档不另造一套偏移。</w:t>
       </w:r>
     </w:p>
     <w:p>
@@ -507,9 +503,9 @@
     </w:p>
     <w:p>
       <w:r>
-        <w:t>verification各目录保存编译、展开、仿真日志及实际输出。pair使用显式IFFT回放夹具验证六对封存/取消/背压；clean/frontstop/stm32使用官方FFT/IFFT，输入在PCM边界注入。预处理用独立Python整数模型逐点比对，窗口用明确的四路计数序列比对。</w:t>
-        <w:br/>
-        <w:t>旧迁移的队列随机1500操作、SPI畸形事务、21项动作保护和时钟原语用例可复用；保留在verification/reused，注明来自同一未改模块的旧执行。它们不是本次又跑了一遍。</w:t>
+        <w:t>document/evidence/inherited/stm32保存迁移前的编译、展开、仿真日志及实际输出。pair使用显式IFFT回放夹具验证六对封存/取消/背压；clean/frontstop/stm32使用官方FFT/IFFT，输入在PCM边界注入。预处理用独立Python整数模型逐点比对，窗口用明确的四路计数序列比对。</w:t>
+        <w:br/>
+        <w:t>旧迁移的队列随机1500操作、SPI畸形事务、21项动作保护和时钟原语用例可复用；保留在document/evidence/inherited/stm32/reused，注明来自同一未改模块的旧执行。它们不是本次又跑了一遍。</w:t>
         <w:br/>
         <w:t>当前双时钟新增pdm用例从四路外部PDM引脚输入同一个PRBS，实际CIC与独立FIR比对7312个PCM值；经官方FFT/IFFT到SPI读取两帧，共124440项检查。仅暖机缩短为32样本，未跳过分帧或计算。最长计算378781个100MHz周期。没有真实声源定位证据，没有新候选实现时序/资源证据，没有板测。默认禁止运动不等于PWM已做机械验证。</w:t>
       </w:r>
@@ -538,13 +534,9 @@
       </w:r>
     </w:p>
     <w:p>
-      <w:r>
-        <w:br w:type="page"/>
-      </w:r>
-    </w:p>
-    <w:p>
       <w:pPr>
         <w:pStyle w:val="Heading1"/>
+        <w:pageBreakBefore/>
       </w:pPr>
       <w:r>
         <w:t>二 已完成验证与实际输出</w:t>
@@ -2181,12 +2173,12 @@
     <w:p/>
     <w:p>
       <w:r>
-        <w:t>上述每项的原始日志保存在相应工程 verification 或 evidence 中。单域基线和未改模块结果用于限定范围回归；旧模块复用结果单列reused。新的双时钟用例独立列出，不能把先前单域结果倒绑到新时钟。自然声源定位、实现STA和板测都未完成。</w:t>
+        <w:t>实际结果分为document/evidence/inherited中的迁移前原件和document/evidence/migration中的新目录复现记录。未改模块的旧执行单列reused，不能倒绑定成新执行；自然声源定位、实现STA与板测仍未完成。</w:t>
       </w:r>
     </w:p>
     <w:p>
       <w:r>
-        <w:t>复现真实计算到SPI的用例：test/run.py stm32。复现冻结双BIST寄存器行为：test/run.py link。PS实验版test/run.py ps产生两份ps_bist输出，test/test_software.py读取这些原始字后调用原S1。没有只运行checker就宣布硬件通过。</w:t>
+        <w:t>从SoundSight根目录执行 simulation/script/run.bat batch stm32 复现单域计算到SPI；batch link 验证冻结双BIST；batch dual、batch pdm、batch pscdc分别验证双域计算、PDM引脚整链、PS跨域。software/tests/test_software.py读取已有AXI仿真原始字并运行S1；software/tests/test_application.py验证应用逻辑。</w:t>
       </w:r>
     </w:p>
     <w:p>
@@ -6639,13 +6631,9 @@
       </w:r>
     </w:p>
     <w:p>
-      <w:r>
-        <w:br w:type="page"/>
-      </w:r>
-    </w:p>
-    <w:p>
       <w:pPr>
         <w:pStyle w:val="Heading1"/>
+        <w:pageBreakBefore/>
       </w:pPr>
       <w:r>
         <w:t>三 STM32主方案的BD和接线</w:t>
@@ -6661,11 +6649,7 @@
     </w:p>
     <w:p>
       <w:r>
-        <w:t>prepare_bd.tcl在空白Vivado里建立独立工程，自动加入源码、XCI、引脚/I/O约束，建BD、Validate并生成顶层wrapper。不会运行综合、实现或下载。原F工程保留。</w:t>
-        <w:br/>
-        <w:t>当前入口已实际通过Vivado2025.2验证。generate_outputs.tcl只生成IP/BD输出；之后综合、实现由A点击。</w:t>
-        <w:br/>
-        <w:t>用户自行配置真实PS板级DDR/MIO/PYNQ环境；脚本里的默认PS参数不是本板可直接启动的preset。</w:t>
+        <w:t>从SoundSight根目录运行 project/script/run.bat prepare stm32；已有工程改用open stm32。源清单为project/script/src_list.txt，BD配方project/bd/stm32.tcl由正式入口调用，不能在任意空工程里单独source。只生成IP/BD输出使用outputs stm32。工程位于project/par/SoundSight.xpr；真实PS7板级参数由A配置。</w:t>
       </w:r>
     </w:p>
     <w:p>
@@ -6685,7 +6669,7 @@
       <w:r>
         <w:t>时钟与复位</w:t>
         <w:br/>
-        <w:t>详细配置和每根线见同目录时钟复位.txt。PS FCLK0=100MHz，经Clocking Wizard输出100MHz计算与61.44MHz采集/控制。</w:t>
+        <w:t>详细配置和每根线见document/design/stm32/时钟复位.txt。PS FCLK0=100MHz，经Clocking Wizard输出100MHz计算与61.44MHz采集/控制。</w:t>
         <w:br/>
         <w:t>clk_main/clk_out2→compute/clk；core_release/dest_arst→compute/rst_n。</w:t>
         <w:br/>
@@ -6715,7 +6699,7 @@
         <w:br/>
         <w:t>pdm_data[3:0]输入、pdm_clocks[3:0]输出接compute；spi_cs_n/spi_sck/spi_mosi输入、spi_miso/irq/servo_pwm输出接link。</w:t>
         <w:br/>
-        <w:t>引脚见hardware/board_pins.xdc，I/O路径限制及使用条件见interface_timing.xdc/.txt。</w:t>
+        <w:t>引脚见project/sdc/stm32/board_pins.xdc；接口约束见同目录interface_timing.xdc，预算见hardware/stm32/interface_timing.txt。</w:t>
         <w:br/>
         <w:t>debug_frontend[3:0]、debug_backend[4:0]属于100MHz；fault_status属于61.44MHz。ILA分别用对应采样时钟，不能把不同域未经处理凑给同一个时钟采样。</w:t>
         <w:br/>
@@ -6724,13 +6708,7 @@
     </w:p>
     <w:p>
       <w:r>
-        <w:t>后续人操作</w:t>
-        <w:br/>
-        <w:t>先阅读模块与连接，需要调整时修改这套独立设计。配置好PS板级参数后Validate Design，运行generate_outputs.tcl，然后由A点击Run Synthesis、Run Implementation。</w:t>
-        <w:br/>
-        <w:t>完成相应run后source export_reports.tcl，再调用ss_reports::save synth或ss_reports::save impl。报告含setup/hold、未约束、CDC、DRC、资源、时钟和I/O；不根据某个WNS自动进入下一步。</w:t>
-        <w:br/>
-        <w:t>本次没有运行综合/实现/板测。BD通过只说明结构可由工具生成，不说明100MHz已经物理收敛。</w:t>
+        <w:t>手动建工程时按源清单加入文件，包括Hann系数；FFT使用project/ip/create_fft_ip.tcl生成ss_fft29与ss_ifft25，不能直接注册参考XCI。先将destination设为本工程输出目录，再在已打开工程中source该IP配方。配置PS、Validate并生成wrapper后，由A点击综合/实现。报告入口为tools/export_reports.tcl，调用ss_reports::save synth或impl。命令行outputs与GUI不能同时写同一工程，完整操作见document/run-guide.md。</w:t>
       </w:r>
     </w:p>
     <w:p>
@@ -6814,6 +6792,8 @@
         <w:t>MMCM输入时钟丢失后，恢复需PS显式拉低RESET1、保持FCLK运行并满足复位脉宽，再解除RESET1等待锁定。这会清旧记录。仅重新打开FCLK不等于已恢复，官方模型已验证这个区别。</w:t>
         <w:br/>
         <w:t>BD Connection Automation可以生成基础Processor System Reset连线，但不认识“总线复位保记录”的项目用途；需按上述分域/分用途核对。</w:t>
+        <w:br/>
+        <w:t>手动配置Processor System Reset时核对C_EXT_RESET_HIGH=0和C_AUX_RESET_HIGH=0；aux低有效接1，debug高有效接0。不能直接假定新IP的默认极性。</w:t>
       </w:r>
     </w:p>
     <w:p>
@@ -6824,9 +6804,53 @@
         <w:br/>
         <w:t>官方时钟/复位模型检查9项通过：启动、两个频率、同步释放、双域总线复位保留记录、时钟丢失时断言复位、显式冷恢复清旧记录。</w:t>
         <w:br/>
-        <w:t>原先常量0接低有效ext/aux会一直复位，以及MMCM复位固定无效导致失锁后不能恢复的试验均保留失败现场，已在当前脚本修正。</w:t>
+        <w:t>历史试验中常量0接低有效ext/aux会一直复位，以及MMCM复位固定无效导致失锁后不能恢复的试验均保留失败现场，已在当前脚本修正。</w:t>
         <w:br/>
         <w:t>100MHz候选的综合、实现STA、CDC/RDC报告和板测仍需人操作后验证。</w:t>
+      </w:r>
+    </w:p>
+    <w:p>
+      <w:pPr>
+        <w:pStyle w:val="Heading2"/>
+      </w:pPr>
+      <w:r>
+        <w:t>手动连线的最后核对</w:t>
+      </w:r>
+    </w:p>
+    <w:p>
+      <w:pPr/>
+      <w:r>
+        <w:t>STM32版13个BD单元，PS版19个。STM32版Module Reference为compute=bd_clean_compute和link=bd_stm32_link；PS版用compute和ps_link=bd_ps_link。两版均不把ss_stm32_tile或旧50MHz时钟模块加入当前BD。</w:t>
+      </w:r>
+    </w:p>
+    <w:p>
+      <w:pPr/>
+      <w:r>
+        <w:t>core_reset/peripheral_aresetn→core_reset_gate/Op1，io_reset/peripheral_aresetn→io_reset_gate/Op1；两个Op2均接clk_audio/locked。gate均为1位AND，Res分别接core_release/src_arst和io_release/src_arst；两个dest_clk分别接100MHz和61.44MHz。</w:t>
+      </w:r>
+    </w:p>
+    <w:p>
+      <w:pPr/>
+      <w:r>
+        <w:t>两套release为XPM CDC Async Reset：同步3级、初始化使能、RST_ACTIVE_HIGH=false；dest_arst在这里低有效。它们分别驱动compute/rst_n和compute/io_rst_n；通信模块rst_n接io_release/dest_arst。不能用普通总线复位替代它。</w:t>
+      </w:r>
+    </w:p>
+    <w:p>
+      <w:pPr/>
+      <w:r>
+        <w:t>PS附加bus_reset、bus_io_reset的dcm_locked均接clk_audio/locked；ext_reset_in接FCLK_RESET0_N、aux_reset_in接1、mb_debug_sys_rst接0。STM32版不实例化这两个总线复位IP。</w:t>
+      </w:r>
+    </w:p>
+    <w:p>
+      <w:pPr/>
+      <w:r>
+        <w:t>DDR_0与FIXED_IO_0引出。compute/debug_frontend和debug_backend为100MHz可选观察输出；通信模块fault_status为61.44MHz可选观察输出，默认可悬空；所有功能输入按逐线表连接。ILA不默认添加，也不能把跨域信号未经处理混到同一个采样时钟。</w:t>
+      </w:r>
+    </w:p>
+    <w:p>
+      <w:pPr/>
+      <w:r>
+        <w:t>完整逐线表：document/design/stm32/BD连线.txt与document/design/ps/PS平台.txt。手工完成后对照这两份表，再Validate；顶层为对应BD生成的wrapper。</w:t>
       </w:r>
     </w:p>
     <w:p>
@@ -8160,13 +8184,9 @@
       </w:r>
     </w:p>
     <w:p>
-      <w:r>
-        <w:br w:type="page"/>
-      </w:r>
-    </w:p>
-    <w:p>
       <w:pPr>
         <w:pStyle w:val="Heading1"/>
+        <w:pageBreakBefore/>
       </w:pPr>
       <w:r>
         <w:t>四 官方IP和存储结构</w:t>
@@ -8655,7 +8675,7 @@
     <w:p/>
     <w:p>
       <w:r>
-        <w:t>共同设置：定点、scaled、convergent rounding、natural order、nonrealtime；相位因子24位；启用aresetn、溢出和输出索引。准确全部component_parameters在随附XCI中。create_fft_ip.tcl按这些参数在新目录创建IP，避免沿用XCI里旧gen_directory。本候选已生成Vivado输出产品，未综合或实现。</w:t>
+        <w:t>共同设置：定点、scaled、convergent rounding、natural order、nonrealtime；相位因子24位；启用aresetn、溢出和输出索引。准确全部component_parameters在随附XCI中。project/ip/create_fft_ip.tcl按这些参数在新目录创建IP，避免沿用XCI里旧gen_directory。本候选已生成Vivado输出产品，未综合或实现。</w:t>
       </w:r>
     </w:p>
     <w:p>
@@ -9633,13 +9653,9 @@
       </w:r>
     </w:p>
     <w:p>
-      <w:r>
-        <w:br w:type="page"/>
-      </w:r>
-    </w:p>
-    <w:p>
       <w:pPr>
         <w:pStyle w:val="Heading1"/>
+        <w:pageBreakBefore/>
       </w:pPr>
       <w:r>
         <w:t>五 PS实验版的区别与剩余工作</w:t>
@@ -9661,7 +9677,7 @@
       <w:r>
         <w:t>时钟和复位</w:t>
         <w:br/>
-        <w:t>与主方案采用相同PS FCLK100→Clocking Wizard→100/61.44MHz结构，具体端口见时钟复位.txt。</w:t>
+        <w:t>与主方案采用相同PS FCLK100→Clocking Wizard→100/61.44MHz结构，具体端口见document/design/ps/时钟复位.txt。</w:t>
         <w:br/>
         <w:t>计算100MHz，采集/寄存器/快照/PWM保护61.44MHz；公共WATCHDOG_TICKS保持原61.44MHz单位。</w:t>
         <w:br/>
@@ -9680,13 +9696,17 @@
     </w:p>
     <w:p>
       <w:r>
-        <w:t>总线与特征</w:t>
-        <w:br/>
         <w:t>PS7/M_AXI_GP0→control_bus/S00_AXI→control_bus/M00_AXI→control_cdc/S_AXI→control_cdc/M_AXI→ps_link/S_AXI。</w:t>
         <w:br/>
-        <w:t>compute与ps_link的feature_valid/pairs/flags/source_faults/draining以及反向feature_ready/enable按主方案同名连接，全部为61.44MHz域。</w:t>
-        <w:br/>
-        <w:t>ps_link/irq→xlconcat的bit0→PS7/IRQ_F2P；其余15位为0。软件先按电平查询，不声称Linux中断驱动完成。</w:t>
+        <w:t>compute/feature_valid → ps_link/feature_valid（1位）；compute/feature_pairs → ps_link/feature_pairs（960位）。</w:t>
+        <w:br/>
+        <w:t>compute/feature_flags → ps_link/feature_flags（32位）；compute/source_faults → ps_link/source_faults（12位）。</w:t>
+        <w:br/>
+        <w:t>compute/draining → ps_link/compute_draining（1位）；ps_link/feature_ready → compute/feature_ready（1位）；ps_link/run_enable → compute/enable（1位）。</w:t>
+        <w:br/>
+        <w:t>上述数据和控制全部为61.44MHz域。draining和run_enable两条线两端名字不同，不能按同名猜接。</w:t>
+        <w:br/>
+        <w:t>ps_link/irq→irq_concat/In0；irq_zero/dout（15位0）→irq_concat/In1；irq_concat/dout（16位）→ps7/IRQ_F2P。软件先按电平查询，不声称Linux中断驱动完成。</w:t>
         <w:br/>
         <w:t>DDR、FIXED_IO引出；四麦和PWM物理引脚与主方案相同。本版不引出STM32 SPI五根线，不提供第二个同时消费快照的入口。</w:t>
       </w:r>
@@ -9695,7 +9715,7 @@
       <w:r>
         <w:t>地址与应用</w:t>
         <w:br/>
-        <w:t>本次实际BD分配ps_link局部4KiB段到0x40000000，证据在verification/bd_preparation。它是工具本次分配结果，不是硬编码公共地址。</w:t>
+        <w:t>本次实际BD分配ps_link局部4KiB段到0x40000000，证据在document/evidence/migration/native/ps。它是工具本次分配结果，不是硬编码公共地址。</w:t>
         <w:br/>
         <w:t>run_capture.py从用户实际HWH读取地址与范围；单一进程持有控制权，调用原S1，先写入JSONL并fsync，再消费硬件槽。</w:t>
         <w:br/>
@@ -9742,7 +9762,7 @@
     </w:p>
     <w:p>
       <w:r>
-        <w:t>software/ss_solver_bridge.c逐字段解码并调用冻结S1；ps_client.py提供底层快照及显式动作接口。run_capture.py是用户运行入口，从实际HWH寻址，单进程所有权，JSONL写入并fsync成功后再消费；保存失败或Ctrl+C先停用并保留锁帧。CLI默认BIST，真实模式也只解算和记录，不开运动。build_solver.sh在目标ARM上构建库，不能使用PC DLL。完整命令见software/运行说明.txt。</w:t>
+        <w:t>software/ps/ss_solver_bridge.c逐字段解码并调用冻结S1；ps_client.py提供底层快照及显式动作接口。run_capture.py是用户运行入口，从实际HWH寻址，单进程所有权，JSONL写入并fsync成功后再消费；保存失败或Ctrl+C先停用并保留锁帧。CLI默认BIST，真实模式也只解算和记录，不开运动。build_solver.sh在目标ARM上构建库，不能使用PC DLL。完整命令见software/ps/运行说明.txt。</w:t>
       </w:r>
     </w:p>
     <w:p>
@@ -12297,13 +12317,9 @@
       </w:r>
     </w:p>
     <w:p>
-      <w:r>
-        <w:br w:type="page"/>
-      </w:r>
-    </w:p>
-    <w:p>
       <w:pPr>
         <w:pStyle w:val="Heading1"/>
+        <w:pageBreakBefore/>
       </w:pPr>
       <w:r>
         <w:t>模块目录与完整接口</w:t>
@@ -12372,7 +12388,7 @@
     </w:p>
     <w:p>
       <w:r>
-        <w:t>源码：STM32_main/rtl/bd_board_clock.v</w:t>
+        <w:t>源码：project/rtl/bd_board_clock.v</w:t>
       </w:r>
     </w:p>
     <w:p>
@@ -12461,7 +12477,7 @@
     </w:p>
     <w:p>
       <w:r>
-        <w:t>源码：STM32_main/rtl/bd_clean_compute.v</w:t>
+        <w:t>源码：project/rtl/bd_clean_compute.v</w:t>
       </w:r>
     </w:p>
     <w:p>
@@ -12556,7 +12572,7 @@
     </w:p>
     <w:p>
       <w:r>
-        <w:t>源码：STM32_main/rtl/bd_stm32_link.v</w:t>
+        <w:t>源码：project/rtl/bd_stm32_link.v</w:t>
       </w:r>
     </w:p>
     <w:p>
@@ -12612,7 +12628,7 @@
     </w:p>
     <w:p>
       <w:r>
-        <w:t>源码：STM32_main/rtl/doa_math_pkg.sv</w:t>
+        <w:t>源码：project/rtl/doa_math_pkg.sv</w:t>
       </w:r>
     </w:p>
     <w:p>
@@ -12688,7 +12704,7 @@
     </w:p>
     <w:p>
       <w:r>
-        <w:t>源码：STM32_main/rtl/doa_math_serial.sv</w:t>
+        <w:t>源码：project/rtl/doa_math_serial.sv</w:t>
       </w:r>
     </w:p>
     <w:p>
@@ -12770,7 +12786,7 @@
     </w:p>
     <w:p>
       <w:r>
-        <w:t>源码：STM32_main/rtl/doa_phat_client.sv</w:t>
+        <w:t>源码：project/rtl/doa_phat_client.sv</w:t>
       </w:r>
     </w:p>
     <w:p>
@@ -12862,7 +12878,7 @@
     </w:p>
     <w:p>
       <w:r>
-        <w:t>源码：STM32_main/rtl/f1a_frame_store.sv</w:t>
+        <w:t>源码：project/rtl/f1a_frame_store.sv</w:t>
       </w:r>
     </w:p>
     <w:p>
@@ -12952,7 +12968,7 @@
     </w:p>
     <w:p>
       <w:r>
-        <w:t>源码：STM32_main/rtl/fft29_official.sv</w:t>
+        <w:t>源码：project/rtl/fft29_official.sv</w:t>
       </w:r>
     </w:p>
     <w:p>
@@ -13028,7 +13044,7 @@
     </w:p>
     <w:p>
       <w:r>
-        <w:t>源码：STM32_main/rtl/i17_turntable_pwm_guard.sv</w:t>
+        <w:t>源码：project/rtl/i17_turntable_pwm_guard.sv</w:t>
       </w:r>
     </w:p>
     <w:p>
@@ -13118,7 +13134,7 @@
     </w:p>
     <w:p>
       <w:r>
-        <w:t>源码：STM32_main/rtl/ifft25_official.sv</w:t>
+        <w:t>源码：project/rtl/ifft25_official.sv</w:t>
       </w:r>
     </w:p>
     <w:p>
@@ -13203,7 +13219,7 @@
     </w:p>
     <w:p>
       <w:r>
-        <w:t>源码：STM32_main/rtl/motor_drive.v</w:t>
+        <w:t>源码：project/rtl/motor_drive.v</w:t>
       </w:r>
     </w:p>
     <w:p>
@@ -13271,7 +13287,7 @@
     </w:p>
     <w:p>
       <w:r>
-        <w:t>源码：STM32_main/rtl/pdm_cic3.v</w:t>
+        <w:t>源码：project/rtl/pdm_cic3.v</w:t>
       </w:r>
     </w:p>
     <w:p>
@@ -13331,7 +13347,7 @@
     </w:p>
     <w:p>
       <w:r>
-        <w:t>源码：STM32_main/rtl/sound_servo_clock.sv</w:t>
+        <w:t>源码：project/rtl/sound_servo_clock.sv</w:t>
       </w:r>
     </w:p>
     <w:p>
@@ -13417,7 +13433,7 @@
     </w:p>
     <w:p>
       <w:r>
-        <w:t>源码：STM32_main/rtl/ss_actuator_control.sv</w:t>
+        <w:t>源码：project/rtl/ss_actuator_control.sv</w:t>
       </w:r>
     </w:p>
     <w:p>
@@ -13489,7 +13505,7 @@
     </w:p>
     <w:p>
       <w:r>
-        <w:t>源码：STM32_main/rtl/ss_async_word.sv</w:t>
+        <w:t>源码：project/rtl/ss_async_word.sv</w:t>
       </w:r>
     </w:p>
     <w:p>
@@ -13553,7 +13569,7 @@
     </w:p>
     <w:p>
       <w:r>
-        <w:t>源码：STM32_main/rtl/ss_bist_source.sv</w:t>
+        <w:t>源码：project/rtl/ss_bist_source.sv</w:t>
       </w:r>
     </w:p>
     <w:p>
@@ -13617,7 +13633,7 @@
     </w:p>
     <w:p>
       <w:r>
-        <w:t>源码：STM32_main/rtl/ss_board_clock.sv</w:t>
+        <w:t>源码：project/rtl/ss_board_clock.sv</w:t>
       </w:r>
     </w:p>
     <w:p>
@@ -13701,7 +13717,7 @@
     </w:p>
     <w:p>
       <w:r>
-        <w:t>源码：STM32_main/rtl/ss_clean_compute.sv</w:t>
+        <w:t>源码：project/rtl/ss_clean_compute.sv</w:t>
       </w:r>
     </w:p>
     <w:p>
@@ -13799,7 +13815,7 @@
     </w:p>
     <w:p>
       <w:r>
-        <w:t>源码：STM32_main/rtl/ss_control_regs.sv</w:t>
+        <w:t>源码：project/rtl/ss_control_regs.sv</w:t>
       </w:r>
     </w:p>
     <w:p>
@@ -13881,7 +13897,7 @@
     </w:p>
     <w:p>
       <w:r>
-        <w:t>源码：STM32_main/rtl/ss_dual_compute.sv</w:t>
+        <w:t>源码：project/rtl/ss_dual_compute.sv</w:t>
       </w:r>
     </w:p>
     <w:p>
@@ -14005,7 +14021,7 @@
     </w:p>
     <w:p>
       <w:r>
-        <w:t>源码：STM32_main/rtl/ss_fft_frontend.sv</w:t>
+        <w:t>源码：project/rtl/ss_fft_frontend.sv</w:t>
       </w:r>
     </w:p>
     <w:p>
@@ -14117,7 +14133,7 @@
     </w:p>
     <w:p>
       <w:r>
-        <w:t>源码：STM32_main/rtl/ss_pair_engine.sv</w:t>
+        <w:t>源码：project/rtl/ss_pair_engine.sv</w:t>
       </w:r>
     </w:p>
     <w:p>
@@ -14199,7 +14215,7 @@
     </w:p>
     <w:p>
       <w:r>
-        <w:t>源码：STM32_main/rtl/ss_pcm_windows.sv</w:t>
+        <w:t>源码：project/rtl/ss_pcm_windows.sv</w:t>
       </w:r>
     </w:p>
     <w:p>
@@ -14273,7 +14289,7 @@
     </w:p>
     <w:p>
       <w:r>
-        <w:t>源码：STM32_main/rtl/ss_pdm_capture.sv</w:t>
+        <w:t>源码：project/rtl/ss_pdm_capture.sv</w:t>
       </w:r>
     </w:p>
     <w:p>
@@ -14363,7 +14379,7 @@
     </w:p>
     <w:p>
       <w:r>
-        <w:t>源码：STM32_main/rtl/ss_preprocess.sv</w:t>
+        <w:t>源码：project/rtl/ss_preprocess.sv</w:t>
       </w:r>
     </w:p>
     <w:p>
@@ -14447,7 +14463,7 @@
     </w:p>
     <w:p>
       <w:r>
-        <w:t>源码：STM32_main/rtl/ss_snapshot_queue.sv</w:t>
+        <w:t>源码：project/rtl/ss_snapshot_queue.sv</w:t>
       </w:r>
     </w:p>
     <w:p>
@@ -14521,7 +14537,7 @@
     </w:p>
     <w:p>
       <w:r>
-        <w:t>源码：STM32_main/rtl/ss_spi_mode0.sv</w:t>
+        <w:t>源码：project/rtl/ss_spi_mode0.sv</w:t>
       </w:r>
     </w:p>
     <w:p>
@@ -14613,7 +14629,7 @@
     </w:p>
     <w:p>
       <w:r>
-        <w:t>源码：STM32_main/rtl/ss_stm32_link.sv</w:t>
+        <w:t>源码：project/rtl/ss_stm32_link.sv</w:t>
       </w:r>
     </w:p>
     <w:p>
@@ -14695,7 +14711,7 @@
     </w:p>
     <w:p>
       <w:r>
-        <w:t>源码：STM32_main/rtl/ss_stm32_tile.sv</w:t>
+        <w:t>源码：project/rtl/ss_stm32_tile.sv</w:t>
       </w:r>
     </w:p>
     <w:p>
@@ -14801,7 +14817,7 @@
     </w:p>
     <w:p>
       <w:r>
-        <w:t>源码：PS_experiment/rtl/ss_axi_lite_regs.sv</w:t>
+        <w:t>源码：project/rtl/ss_axi_lite_regs.sv</w:t>
       </w:r>
     </w:p>
     <w:p>
@@ -14899,7 +14915,7 @@
     </w:p>
     <w:p>
       <w:r>
-        <w:t>源码：PS_experiment/rtl/ss_ps_control_regs.sv</w:t>
+        <w:t>源码：project/rtl/ss_ps_control_regs.sv</w:t>
       </w:r>
     </w:p>
     <w:p>
@@ -15025,7 +15041,7 @@
     </w:p>
     <w:p>
       <w:r>
-        <w:t>源码：PS_experiment/rtl/ss_ps_link.sv</w:t>
+        <w:t>源码：project/rtl/ss_ps_link.sv</w:t>
       </w:r>
     </w:p>
     <w:p>
@@ -15153,17 +15169,13 @@
     </w:p>
     <w:p>
       <w:r>
-        <w:t>源码：PS_experiment/rtl/bd_ps_link.v</w:t>
-      </w:r>
-    </w:p>
-    <w:p>
-      <w:r>
-        <w:br w:type="page"/>
+        <w:t>源码：project/rtl/bd_ps_link.v</w:t>
       </w:r>
     </w:p>
     <w:p>
       <w:pPr>
         <w:pStyle w:val="Heading1"/>
+        <w:pageBreakBefore/>
       </w:pPr>
       <w:r>
         <w:t>七 文件位置和复现入口</w:t>
@@ -15171,17 +15183,17 @@
     </w:p>
     <w:p>
       <w:r>
-        <w:t>交付包内STM32_main是主方案；PS_experiment是独立无STM32试验；hardware_reference集中保留FPGA原理图/板卡资料；本Word与模块HTML可离线阅读。目录不包含xsim.dir、WDB、运行中间目录、旧综合缓存、bit或虚构XPR。</w:t>
+        <w:t>SoundSight只维护一份project/rtl和software/common。主方案原生工程在project/par，PS版在variants/pl_ps/project/par；硬件资料在hardware/reference，模块总表在document/modules/RTL-INTERFACES.html，完整逐线表在document/design/stm32/BD连线.txt及document/design/ps/PS平台.txt。</w:t>
       </w:r>
     </w:p>
     <w:p>
       <w:r>
-        <w:t>原仓库保留全部旧工程、失败日志和未归档修改。去掉它们在便携交付包中的副本，不等于删除原件。构造历史脚本也没有成为新的核收流程。</w:t>
+        <w:t>必要旧技术原件保存在local_archive，失败日志和验证结果在document/evidence；它们不作为新构建入口。旧仓库和F盘旧工程可以退出使用，不影响本项目的源码和配置。</w:t>
       </w:r>
     </w:p>
     <w:p>
       <w:r>
-        <w:t>仓库根目录复现：python -E -s -B -X utf8 migration/clean_pl_20261017/test/run.py case。case可选dual、cdc、samplecdc、pdm、pair、preprocess、capture、link、clean、frontstop、stm32；时钟复位IP用test/run_platform.py。另有未改模块queue/spi/actuator和旧clock回归。PS版test/run.py可选axi、ps、pscdc；CPU用test/test_software.py和test/test_application.py。解压包内从对应版本目录运行相同test相对路径。</w:t>
+        <w:t>从SoundSight根目录复现：simulation/script/run.bat batch &lt;case&gt;。case包括dual、cdc、samplecdc、pdm、pair、preprocess、capture、link、clean、frontstop、stm32、platform、queue、spi、actuator、clock、axi、ps、pscdc。PC检查执行python -E -s -B -X utf8 software/tests/test_software.py以及software/tests/test_application.py。输出分别进入simulation/work和software/build。</w:t>
       </w:r>
     </w:p>
     <w:p>
@@ -15199,7 +15211,7 @@
     </w:p>
     <w:p>
       <w:r>
-        <w:t>先阅读架构、BD和你关心的模块，标出想调整的功能/接口；此阶段无需启动Vivado。你已决定自行填写DDR、PS板级设置与PYNQ镜像；实际综合和实现仍由你点击，完成后分析本候选报告。B继续S2，双方按v2核对实物接线，再验证ID/双BIST、真实声学和停止恢复；机械配置与闭环最后接入。PS↔STM32遥测和展示在基础接合后安排。</w:t>
+        <w:t>新建工程先看源清单、BD连线和模块接口；按实际板卡填写DDR、MIO与PYNQ配置。B的S2仍按收到的v2材料接续。验证阶段依次核对接口、双BIST、真实声学和停止恢复，机械标定与闭环随后进行；当前资料不声称这些步骤已完成。</w:t>
       </w:r>
     </w:p>
     <w:p>
@@ -15212,12 +15224,12 @@
     </w:p>
     <w:p>
       <w:r>
-        <w:t>依据包括冻结ABI/S1、B的v2两份原文、29张主目录模块卡片（含明确标注的旧回归参考）与PS新增4张、verification原始日志、领航者底板V3.9/核心板V2.5原理图和板卡规格V1.2。旧C PR65仅作参考，未当作新平台已运行。</w:t>
+        <w:t>依据包括冻结ABI/S1、B的v2两份原文、29张主目录模块卡片（含明确标注的旧回归参考）与PS新增4张、document/evidence中的原始日志、领航者底板V3.9/核心板V2.5原理图和板卡规格V1.2。旧C PR65仅作参考，未当作新平台已运行。</w:t>
       </w:r>
     </w:p>
     <w:p>
       <w:r>
-        <w:t>官方资料：AMD Vivado UG994、Clocking Wizard PG065、Processor System Reset PG164、XPM_FIFO_ASYNC UG953及Zynq DS187；PYNQ2.7 MMIO API。网址见PS_experiment/documentation/PS平台.txt。</w:t>
+        <w:t>官方资料：AMD Vivado UG994、Clocking Wizard PG065、Processor System Reset PG164、XPM_FIFO_ASYNC UG953及Zynq DS187；PYNQ2.7 MMIO API。网址见document/design/ps/PS平台.txt。</w:t>
       </w:r>
     </w:p>
     <w:sectPr>

</xml_diff>